<commit_message>
spec: regenerate v0.6 internal API artifacts
Co-authored-by: Henry Perkins <htperkins@gmail.com>
</commit_message>
<xml_diff>
--- a/spec-bundle/pattern_like_astrology_app_product_platform_spec_v0.6.docx
+++ b/spec-bundle/pattern_like_astrology_app_product_platform_spec_v0.6.docx
@@ -1429,7 +1429,49 @@
         <w:rPr>
           <w:b w:val="0"/>
         </w:rPr>
-        <w:t>All mutating endpoints require an idempotency key.</w:t>
+        <w:t xml:space="preserve">All consumer mutating endpoints require an idempotency key. The M7 internal operations are semantically keyed instead: signed ontology bytes plus </w:t>
+      </w:r>
+      <w:r>
+        <w:rPr>
+          <w:rFonts w:ascii="Consolas" w:hAnsi="Consolas"/>
+          <w:b w:val="0"/>
+          <w:sz w:val="19"/>
+        </w:rPr>
+        <w:t>ontology_version</w:t>
+      </w:r>
+      <w:r>
+        <w:rPr>
+          <w:b w:val="0"/>
+        </w:rPr>
+        <w:t xml:space="preserve"> identify ingestion, </w:t>
+      </w:r>
+      <w:r>
+        <w:rPr>
+          <w:rFonts w:ascii="Consolas" w:hAnsi="Consolas"/>
+          <w:b w:val="0"/>
+          <w:sz w:val="19"/>
+        </w:rPr>
+        <w:t>ontology_version</w:t>
+      </w:r>
+      <w:r>
+        <w:rPr>
+          <w:b w:val="0"/>
+        </w:rPr>
+        <w:t xml:space="preserve"> identifies recall, and </w:t>
+      </w:r>
+      <w:r>
+        <w:rPr>
+          <w:rFonts w:ascii="Consolas" w:hAnsi="Consolas"/>
+          <w:b w:val="0"/>
+          <w:sz w:val="19"/>
+        </w:rPr>
+        <w:t>generation_id</w:t>
+      </w:r>
+      <w:r>
+        <w:rPr>
+          <w:b w:val="0"/>
+        </w:rPr>
+        <w:t xml:space="preserve"> identifies reconciliation. Exact replay must converge; these service-token routes do not accept a separate caller-generated key.</w:t>
       </w:r>
     </w:p>
     <w:p>

</xml_diff>